<commit_message>
docs: update CU06 to Django sessions and account deactivation (#42)
</commit_message>
<xml_diff>
--- a/Anexos/Diseño/Plantilla de C.U 06.docx
+++ b/Anexos/Diseño/Plantilla de C.U 06.docx
@@ -614,7 +614,7 @@
                 <w:color w:val="1f1f1f"/>
                 <w:rtl w:val="0"/>
               </w:rPr>
-              <w:t xml:space="preserve">El sistema crea la cuenta y envía al correo del usuario un enlace de un solo uso para que defina su contraseña (no se envían contraseñas por correo).</w:t>
+              <w:t xml:space="preserve">El sistema crea la cuenta y envía al correo del usuario un enlace de un solo uso para que defina su contraseña (no se envían contraseñas por correo). En desarrollo el correo se imprime en la consola del servidor; falta configurar SMTP para enviarlo de verdad.</w:t>
             </w:r>
             <w:r>
               <w:rPr>
@@ -770,7 +770,7 @@
                 <w:color w:val="1f1f1f"/>
                 <w:rtl w:val="0"/>
               </w:rPr>
-              <w:t xml:space="preserve">: Si un empleado ya no trabaja en la tienda, el Administrador cambia su estado a "Inactivo". El sistema invalida inmediatamente sus tokens de sesión activos.</w:t>
+              <w:t xml:space="preserve">: Si un empleado ya no trabaja en la tienda, el Administrador cambia su estado a "Inactivo". El sistema cierra inmediatamente sus sesiones activas. Las cuentas no se borran, se desactivan, para no perder el historial (quién hizo cada análisis).</w:t>
             </w:r>
             <w:r>
               <w:rPr>

</xml_diff>